<commit_message>
S4 L1: Matterport, voz e vídeos passam para o S5
Evidências, guião, plano e CLAUDE.md atualizados: quiz e reflexão já na Udemy (rever no S5).

Co-Authored-By: Claude Opus 5.5 <noreply@anthropic.com>
</commit_message>
<xml_diff>
--- a/Files/P1/L1/S4_Evidencias_L1_Grupo1.docx
+++ b/Files/P1/L1/S4_Evidencias_L1_Grupo1.docx
@@ -736,7 +736,7 @@
                 <w:sz w:val="19"/>
                 <w:szCs w:val="19"/>
               </w:rPr>
-              <w:t>Modelo visual comum das 5 lições, vídeo da L1 em PowerPoint com a narração nas notas, infografia dos PSP. Faltam as ilustrações, a voz e o MP4 do gancho.</w:t>
+              <w:t>Modelo visual comum das 5 lições, vídeo da L1 em PowerPoint com a narração nas notas, infografia dos PSP. As ilustrações, a voz e o MP4 passam para o S5.</w:t>
             </w:r>
           </w:p>
         </w:tc>
@@ -854,7 +854,7 @@
                 <w:sz w:val="19"/>
                 <w:szCs w:val="19"/>
               </w:rPr>
-              <w:t>Integração definida: lugar reservado no vídeo, tags e roteiro propostos (secção 6). Falta capturar a casa (a decidir com o grupo).</w:t>
+              <w:t>Integração definida: lugar reservado no vídeo, tags e roteiro propostos (secção 6). A captura da casa e a gravação da visita passam para o S5 (a decidir com o grupo).</w:t>
             </w:r>
           </w:p>
         </w:tc>
@@ -934,7 +934,7 @@
                 <w:sz w:val="19"/>
                 <w:szCs w:val="19"/>
               </w:rPr>
-              <w:t>Em curso</w:t>
+              <w:t>Feito</w:t>
             </w:r>
           </w:p>
         </w:tc>
@@ -972,7 +972,7 @@
                 <w:sz w:val="19"/>
                 <w:szCs w:val="19"/>
               </w:rPr>
-              <w:t>Reflexão e quiz de 4 perguntas com feedback por opção (secção 7). Falta criá-los na Udemy.</w:t>
+              <w:t>Reflexão e quiz de 4 perguntas com feedback por opção (secção 7). Já criados na Udemy (secção 1); a rever no S5.</w:t>
             </w:r>
           </w:p>
         </w:tc>
@@ -3900,7 +3900,7 @@
           <w:sz w:val="21"/>
           <w:szCs w:val="21"/>
         </w:rPr>
-        <w:t>Cada cena corresponde a um diapositivo do vídeo (PowerPoint → vídeo Full HD 1080p). Os retângulos tracejados marcam onde ficam as ilustrações planas, que estão em produção.</w:t>
+        <w:t>Cada cena corresponde a um diapositivo do vídeo (PowerPoint → vídeo Full HD 1080p). Os retângulos tracejados marcam onde ficam as ilustrações planas, que passam para o S5.</w:t>
       </w:r>
     </w:p>
     <w:tbl>
@@ -5677,7 +5677,7 @@
                 <w:sz w:val="19"/>
                 <w:szCs w:val="19"/>
               </w:rPr>
-              <w:t>Diapositivos e narração feitos; falta gravar</w:t>
+              <w:t>Diapositivos e narração feitos; gravar no S5</w:t>
             </w:r>
           </w:p>
         </w:tc>
@@ -5793,7 +5793,7 @@
                 <w:sz w:val="19"/>
                 <w:szCs w:val="19"/>
               </w:rPr>
-              <w:t>Texto final nas notas; teste de áudio por fazer</w:t>
+              <w:t>Texto final nas notas; teste de áudio e gravação no S5</w:t>
             </w:r>
           </w:p>
         </w:tc>
@@ -5909,7 +5909,7 @@
                 <w:sz w:val="19"/>
                 <w:szCs w:val="19"/>
               </w:rPr>
-              <w:t>Por escolher</w:t>
+              <w:t>A escolher no S5</w:t>
             </w:r>
           </w:p>
         </w:tc>
@@ -6025,7 +6025,7 @@
                 <w:sz w:val="19"/>
                 <w:szCs w:val="19"/>
               </w:rPr>
-              <w:t xml:space="preserve">Link: </w:t>
+              <w:t xml:space="preserve">S5 </w:t>
             </w:r>
             <w:r>
               <w:rPr>
@@ -6036,7 +6036,7 @@
                 <w:sz w:val="19"/>
                 <w:szCs w:val="19"/>
               </w:rPr>
-              <w:t>(a acrescentar)</w:t>
+              <w:t>(depois de gravada a voz)</w:t>
             </w:r>
           </w:p>
         </w:tc>
@@ -7122,7 +7122,7 @@
           <w:sz w:val="21"/>
           <w:szCs w:val="21"/>
         </w:rPr>
-        <w:t>Visita 3D (opcional): abra a casa da D. Rosa e encontre 3 coisas que lhe dão segurança. (link a acrescentar)</w:t>
+        <w:t>Visita 3D (opcional): abra a casa da D. Rosa e encontre 3 coisas que lhe dão segurança. (link no S5)</w:t>
       </w:r>
     </w:p>
     <w:p>
@@ -8095,7 +8095,7 @@
           <w:sz w:val="21"/>
           <w:szCs w:val="21"/>
         </w:rPr>
-        <w:t>Captura do quiz na Udemy (vista de aluno): (a acrescentar)</w:t>
+        <w:t>Estado: quiz e reflexão já criados na Udemy (secção 1, aulas 1.2 e 1.3); a rever no S5.</w:t>
       </w:r>
     </w:p>
     <w:p>
@@ -8133,7 +8133,7 @@
           <w:sz w:val="21"/>
           <w:szCs w:val="21"/>
         </w:rPr>
-        <w:t>Ilustrações planas em todos os diapositivos; gravar a voz e exportar os dois vídeos em 1080p.</w:t>
+        <w:t>Ilustrações planas em todos os diapositivos; escolher a música; teste de áudio, gravar a voz e exportar os dois vídeos em 1080p.</w:t>
       </w:r>
     </w:p>
     <w:p>
@@ -8157,7 +8157,7 @@
           <w:sz w:val="21"/>
           <w:szCs w:val="21"/>
         </w:rPr>
-        <w:t>Quiz e reflexão criados na Udemy e testados como aluno.</w:t>
+        <w:t>Rever o quiz e a reflexão na Udemy (já criados) e testar como aluno.</w:t>
       </w:r>
     </w:p>
     <w:p>

</xml_diff>